<commit_message>
Update source code link in thesis documents to reflect new repository
</commit_message>
<xml_diff>
--- a/Comparative Performance Analysis Thesis Book.docx
+++ b/Comparative Performance Analysis Thesis Book.docx
@@ -250,12 +250,12 @@
           <wp:inline distB="0" distT="0" distL="0" distR="0">
             <wp:extent cx="1581641" cy="1553619"/>
             <wp:effectExtent b="0" l="0" r="0" t="0"/>
-            <wp:docPr id="12" name="image3.png"/>
+            <wp:docPr id="12" name="image2.png"/>
             <a:graphic>
               <a:graphicData uri="http://schemas.openxmlformats.org/drawingml/2006/picture">
                 <pic:pic>
                   <pic:nvPicPr>
-                    <pic:cNvPr id="0" name="image3.png"/>
+                    <pic:cNvPr id="0" name="image2.png"/>
                     <pic:cNvPicPr preferRelativeResize="0"/>
                   </pic:nvPicPr>
                   <pic:blipFill>
@@ -1416,12 +1416,12 @@
                 <wp:extent cx="2228215" cy="22225"/>
                 <wp:effectExtent b="0" l="0" r="0" t="0"/>
                 <wp:wrapNone/>
-                <wp:docPr id="2" name="image9.png"/>
+                <wp:docPr id="2" name="image40.png"/>
                 <a:graphic>
                   <a:graphicData uri="http://schemas.openxmlformats.org/drawingml/2006/picture">
                     <pic:pic>
                       <pic:nvPicPr>
-                        <pic:cNvPr id="0" name="image9.png"/>
+                        <pic:cNvPr id="0" name="image40.png"/>
                         <pic:cNvPicPr preferRelativeResize="0"/>
                       </pic:nvPicPr>
                       <pic:blipFill>
@@ -1651,12 +1651,12 @@
                 <wp:extent cx="2228215" cy="22225"/>
                 <wp:effectExtent b="0" l="0" r="0" t="0"/>
                 <wp:wrapNone/>
-                <wp:docPr id="1" name="image7.png"/>
+                <wp:docPr id="1" name="image39.png"/>
                 <a:graphic>
                   <a:graphicData uri="http://schemas.openxmlformats.org/drawingml/2006/picture">
                     <pic:pic>
                       <pic:nvPicPr>
-                        <pic:cNvPr id="0" name="image7.png"/>
+                        <pic:cNvPr id="0" name="image39.png"/>
                         <pic:cNvPicPr preferRelativeResize="0"/>
                       </pic:nvPicPr>
                       <pic:blipFill>
@@ -2394,12 +2394,12 @@
                 <wp:extent cx="2228215" cy="22225"/>
                 <wp:effectExtent b="0" l="0" r="0" t="0"/>
                 <wp:wrapNone/>
-                <wp:docPr id="5" name="image41.png"/>
+                <wp:docPr id="5" name="image43.png"/>
                 <a:graphic>
                   <a:graphicData uri="http://schemas.openxmlformats.org/drawingml/2006/picture">
                     <pic:pic>
                       <pic:nvPicPr>
-                        <pic:cNvPr id="0" name="image41.png"/>
+                        <pic:cNvPr id="0" name="image43.png"/>
                         <pic:cNvPicPr preferRelativeResize="0"/>
                       </pic:nvPicPr>
                       <pic:blipFill>
@@ -2986,12 +2986,12 @@
                 <wp:extent cx="2305050" cy="1390650"/>
                 <wp:effectExtent b="0" l="0" r="0" t="0"/>
                 <wp:wrapNone/>
-                <wp:docPr id="3" name="image18.png"/>
+                <wp:docPr id="3" name="image41.png"/>
                 <a:graphic>
                   <a:graphicData uri="http://schemas.openxmlformats.org/drawingml/2006/picture">
                     <pic:pic>
                       <pic:nvPicPr>
-                        <pic:cNvPr id="0" name="image18.png"/>
+                        <pic:cNvPr id="0" name="image41.png"/>
                         <pic:cNvPicPr preferRelativeResize="0"/>
                       </pic:nvPicPr>
                       <pic:blipFill>
@@ -3236,12 +3236,12 @@
                 <wp:extent cx="2305050" cy="1390650"/>
                 <wp:effectExtent b="0" l="0" r="0" t="0"/>
                 <wp:wrapNone/>
-                <wp:docPr id="4" name="image19.png"/>
+                <wp:docPr id="4" name="image42.png"/>
                 <a:graphic>
                   <a:graphicData uri="http://schemas.openxmlformats.org/drawingml/2006/picture">
                     <pic:pic>
                       <pic:nvPicPr>
-                        <pic:cNvPr id="0" name="image19.png"/>
+                        <pic:cNvPr id="0" name="image42.png"/>
                         <pic:cNvPicPr preferRelativeResize="0"/>
                       </pic:nvPicPr>
                       <pic:blipFill>
@@ -4189,7 +4189,7 @@
     </w:p>
     <w:sdt>
       <w:sdtPr>
-        <w:id w:val="209350078"/>
+        <w:id w:val="-1467901316"/>
         <w:docPartObj>
           <w:docPartGallery w:val="Table of Contents"/>
           <w:docPartUnique w:val="1"/>
@@ -10435,12 +10435,12 @@
           <wp:inline distB="114300" distT="114300" distL="114300" distR="114300">
             <wp:extent cx="4029075" cy="1245522"/>
             <wp:effectExtent b="0" l="0" r="0" t="0"/>
-            <wp:docPr id="33" name="image30.png"/>
+            <wp:docPr id="33" name="image24.png"/>
             <a:graphic>
               <a:graphicData uri="http://schemas.openxmlformats.org/drawingml/2006/picture">
                 <pic:pic>
                   <pic:nvPicPr>
-                    <pic:cNvPr id="0" name="image30.png"/>
+                    <pic:cNvPr id="0" name="image24.png"/>
                     <pic:cNvPicPr preferRelativeResize="0"/>
                   </pic:nvPicPr>
                   <pic:blipFill>
@@ -12678,12 +12678,12 @@
           <wp:inline distB="114300" distT="114300" distL="114300" distR="114300">
             <wp:extent cx="1666875" cy="3402883"/>
             <wp:effectExtent b="0" l="0" r="0" t="0"/>
-            <wp:docPr id="47" name="image42.png"/>
+            <wp:docPr id="47" name="image34.png"/>
             <a:graphic>
               <a:graphicData uri="http://schemas.openxmlformats.org/drawingml/2006/picture">
                 <pic:pic>
                   <pic:nvPicPr>
-                    <pic:cNvPr id="0" name="image42.png"/>
+                    <pic:cNvPr id="0" name="image34.png"/>
                     <pic:cNvPicPr preferRelativeResize="0"/>
                   </pic:nvPicPr>
                   <pic:blipFill>
@@ -12780,12 +12780,12 @@
           <wp:inline distB="114300" distT="114300" distL="114300" distR="114300">
             <wp:extent cx="5366594" cy="3371931"/>
             <wp:effectExtent b="0" l="0" r="0" t="0"/>
-            <wp:docPr id="14" name="image6.png"/>
+            <wp:docPr id="14" name="image16.png"/>
             <a:graphic>
               <a:graphicData uri="http://schemas.openxmlformats.org/drawingml/2006/picture">
                 <pic:pic>
                   <pic:nvPicPr>
-                    <pic:cNvPr id="0" name="image6.png"/>
+                    <pic:cNvPr id="0" name="image16.png"/>
                     <pic:cNvPicPr preferRelativeResize="0"/>
                   </pic:nvPicPr>
                   <pic:blipFill>
@@ -12876,12 +12876,12 @@
           <wp:inline distB="114300" distT="114300" distL="114300" distR="114300">
             <wp:extent cx="5186363" cy="3284065"/>
             <wp:effectExtent b="0" l="0" r="0" t="0"/>
-            <wp:docPr id="32" name="image28.png"/>
+            <wp:docPr id="32" name="image30.png"/>
             <a:graphic>
               <a:graphicData uri="http://schemas.openxmlformats.org/drawingml/2006/picture">
                 <pic:pic>
                   <pic:nvPicPr>
-                    <pic:cNvPr id="0" name="image28.png"/>
+                    <pic:cNvPr id="0" name="image30.png"/>
                     <pic:cNvPicPr preferRelativeResize="0"/>
                   </pic:nvPicPr>
                   <pic:blipFill>
@@ -13299,12 +13299,12 @@
           <wp:inline distB="114300" distT="114300" distL="114300" distR="114300">
             <wp:extent cx="5324475" cy="1262796"/>
             <wp:effectExtent b="0" l="0" r="0" t="0"/>
-            <wp:docPr id="18" name="image13.png"/>
+            <wp:docPr id="18" name="image18.png"/>
             <a:graphic>
               <a:graphicData uri="http://schemas.openxmlformats.org/drawingml/2006/picture">
                 <pic:pic>
                   <pic:nvPicPr>
-                    <pic:cNvPr id="0" name="image13.png"/>
+                    <pic:cNvPr id="0" name="image18.png"/>
                     <pic:cNvPicPr preferRelativeResize="0"/>
                   </pic:nvPicPr>
                   <pic:blipFill>
@@ -13439,12 +13439,12 @@
           <wp:inline distB="114300" distT="114300" distL="114300" distR="114300">
             <wp:extent cx="3486150" cy="2557463"/>
             <wp:effectExtent b="0" l="0" r="0" t="0"/>
-            <wp:docPr id="37" name="image33.png"/>
+            <wp:docPr id="37" name="image36.png"/>
             <a:graphic>
               <a:graphicData uri="http://schemas.openxmlformats.org/drawingml/2006/picture">
                 <pic:pic>
                   <pic:nvPicPr>
-                    <pic:cNvPr id="0" name="image33.png"/>
+                    <pic:cNvPr id="0" name="image36.png"/>
                     <pic:cNvPicPr preferRelativeResize="0"/>
                   </pic:nvPicPr>
                   <pic:blipFill>
@@ -13621,12 +13621,12 @@
           <wp:inline distB="114300" distT="114300" distL="114300" distR="114300">
             <wp:extent cx="3976688" cy="2951373"/>
             <wp:effectExtent b="0" l="0" r="0" t="0"/>
-            <wp:docPr id="10" name="image2.png"/>
+            <wp:docPr id="10" name="image13.png"/>
             <a:graphic>
               <a:graphicData uri="http://schemas.openxmlformats.org/drawingml/2006/picture">
                 <pic:pic>
                   <pic:nvPicPr>
-                    <pic:cNvPr id="0" name="image2.png"/>
+                    <pic:cNvPr id="0" name="image13.png"/>
                     <pic:cNvPicPr preferRelativeResize="0"/>
                   </pic:nvPicPr>
                   <pic:blipFill>
@@ -13675,12 +13675,12 @@
           <wp:inline distB="114300" distT="114300" distL="114300" distR="114300">
             <wp:extent cx="1728788" cy="701119"/>
             <wp:effectExtent b="0" l="0" r="0" t="0"/>
-            <wp:docPr id="19" name="image12.png"/>
+            <wp:docPr id="19" name="image20.png"/>
             <a:graphic>
               <a:graphicData uri="http://schemas.openxmlformats.org/drawingml/2006/picture">
                 <pic:pic>
                   <pic:nvPicPr>
-                    <pic:cNvPr id="0" name="image12.png"/>
+                    <pic:cNvPr id="0" name="image20.png"/>
                     <pic:cNvPicPr preferRelativeResize="0"/>
                   </pic:nvPicPr>
                   <pic:blipFill>
@@ -13778,12 +13778,12 @@
           <wp:inline distB="114300" distT="114300" distL="114300" distR="114300">
             <wp:extent cx="2645981" cy="465227"/>
             <wp:effectExtent b="0" l="0" r="0" t="0"/>
-            <wp:docPr id="29" name="image24.png"/>
+            <wp:docPr id="29" name="image17.png"/>
             <a:graphic>
               <a:graphicData uri="http://schemas.openxmlformats.org/drawingml/2006/picture">
                 <pic:pic>
                   <pic:nvPicPr>
-                    <pic:cNvPr id="0" name="image24.png"/>
+                    <pic:cNvPr id="0" name="image17.png"/>
                     <pic:cNvPicPr preferRelativeResize="0"/>
                   </pic:nvPicPr>
                   <pic:blipFill>
@@ -13881,12 +13881,12 @@
           <wp:inline distB="114300" distT="114300" distL="114300" distR="114300">
             <wp:extent cx="3475149" cy="624959"/>
             <wp:effectExtent b="0" l="0" r="0" t="0"/>
-            <wp:docPr id="20" name="image15.png"/>
+            <wp:docPr id="20" name="image6.png"/>
             <a:graphic>
               <a:graphicData uri="http://schemas.openxmlformats.org/drawingml/2006/picture">
                 <pic:pic>
                   <pic:nvPicPr>
-                    <pic:cNvPr id="0" name="image15.png"/>
+                    <pic:cNvPr id="0" name="image6.png"/>
                     <pic:cNvPicPr preferRelativeResize="0"/>
                   </pic:nvPicPr>
                   <pic:blipFill>
@@ -13988,12 +13988,12 @@
           <wp:inline distB="114300" distT="114300" distL="114300" distR="114300">
             <wp:extent cx="5424488" cy="1548513"/>
             <wp:effectExtent b="0" l="0" r="0" t="0"/>
-            <wp:docPr id="13" name="image5.png"/>
+            <wp:docPr id="13" name="image8.png"/>
             <a:graphic>
               <a:graphicData uri="http://schemas.openxmlformats.org/drawingml/2006/picture">
                 <pic:pic>
                   <pic:nvPicPr>
-                    <pic:cNvPr id="0" name="image5.png"/>
+                    <pic:cNvPr id="0" name="image8.png"/>
                     <pic:cNvPicPr preferRelativeResize="0"/>
                   </pic:nvPicPr>
                   <pic:blipFill>
@@ -14106,12 +14106,12 @@
           <wp:inline distB="114300" distT="114300" distL="114300" distR="114300">
             <wp:extent cx="2647777" cy="738228"/>
             <wp:effectExtent b="0" l="0" r="0" t="0"/>
-            <wp:docPr id="15" name="image8.png"/>
+            <wp:docPr id="15" name="image1.png"/>
             <a:graphic>
               <a:graphicData uri="http://schemas.openxmlformats.org/drawingml/2006/picture">
                 <pic:pic>
                   <pic:nvPicPr>
-                    <pic:cNvPr id="0" name="image8.png"/>
+                    <pic:cNvPr id="0" name="image1.png"/>
                     <pic:cNvPicPr preferRelativeResize="0"/>
                   </pic:nvPicPr>
                   <pic:blipFill>
@@ -14224,12 +14224,12 @@
           <wp:inline distB="114300" distT="114300" distL="114300" distR="114300">
             <wp:extent cx="5572125" cy="542418"/>
             <wp:effectExtent b="0" l="0" r="0" t="0"/>
-            <wp:docPr id="21" name="image14.png"/>
+            <wp:docPr id="21" name="image3.png"/>
             <a:graphic>
               <a:graphicData uri="http://schemas.openxmlformats.org/drawingml/2006/picture">
                 <pic:pic>
                   <pic:nvPicPr>
-                    <pic:cNvPr id="0" name="image14.png"/>
+                    <pic:cNvPr id="0" name="image3.png"/>
                     <pic:cNvPicPr preferRelativeResize="0"/>
                   </pic:nvPicPr>
                   <pic:blipFill>
@@ -14389,12 +14389,12 @@
           <wp:inline distB="114300" distT="114300" distL="114300" distR="114300">
             <wp:extent cx="4862513" cy="1589304"/>
             <wp:effectExtent b="0" l="0" r="0" t="0"/>
-            <wp:docPr id="40" name="image36.png"/>
+            <wp:docPr id="40" name="image25.png"/>
             <a:graphic>
               <a:graphicData uri="http://schemas.openxmlformats.org/drawingml/2006/picture">
                 <pic:pic>
                   <pic:nvPicPr>
-                    <pic:cNvPr id="0" name="image36.png"/>
+                    <pic:cNvPr id="0" name="image25.png"/>
                     <pic:cNvPicPr preferRelativeResize="0"/>
                   </pic:nvPicPr>
                   <pic:blipFill>
@@ -14507,12 +14507,12 @@
           <wp:inline distB="114300" distT="114300" distL="114300" distR="114300">
             <wp:extent cx="5019675" cy="2602074"/>
             <wp:effectExtent b="0" l="0" r="0" t="0"/>
-            <wp:docPr id="11" name="image4.png"/>
+            <wp:docPr id="11" name="image7.png"/>
             <a:graphic>
               <a:graphicData uri="http://schemas.openxmlformats.org/drawingml/2006/picture">
                 <pic:pic>
                   <pic:nvPicPr>
-                    <pic:cNvPr id="0" name="image4.png"/>
+                    <pic:cNvPr id="0" name="image7.png"/>
                     <pic:cNvPicPr preferRelativeResize="0"/>
                   </pic:nvPicPr>
                   <pic:blipFill>
@@ -14609,12 +14609,12 @@
           <wp:inline distB="114300" distT="114300" distL="114300" distR="114300">
             <wp:extent cx="5567933" cy="3833813"/>
             <wp:effectExtent b="0" l="0" r="0" t="0"/>
-            <wp:docPr id="34" name="image29.png"/>
+            <wp:docPr id="34" name="image26.png"/>
             <a:graphic>
               <a:graphicData uri="http://schemas.openxmlformats.org/drawingml/2006/picture">
                 <pic:pic>
                   <pic:nvPicPr>
-                    <pic:cNvPr id="0" name="image29.png"/>
+                    <pic:cNvPr id="0" name="image26.png"/>
                     <pic:cNvPicPr preferRelativeResize="0"/>
                   </pic:nvPicPr>
                   <pic:blipFill>
@@ -14724,12 +14724,12 @@
           <wp:inline distB="114300" distT="114300" distL="114300" distR="114300">
             <wp:extent cx="5529263" cy="447675"/>
             <wp:effectExtent b="0" l="0" r="0" t="0"/>
-            <wp:docPr id="9" name="image1.png"/>
+            <wp:docPr id="9" name="image19.png"/>
             <a:graphic>
               <a:graphicData uri="http://schemas.openxmlformats.org/drawingml/2006/picture">
                 <pic:pic>
                   <pic:nvPicPr>
-                    <pic:cNvPr id="0" name="image1.png"/>
+                    <pic:cNvPr id="0" name="image19.png"/>
                     <pic:cNvPicPr preferRelativeResize="0"/>
                   </pic:nvPicPr>
                   <pic:blipFill>
@@ -14780,12 +14780,12 @@
           <wp:inline distB="114300" distT="114300" distL="114300" distR="114300">
             <wp:extent cx="4553644" cy="2418209"/>
             <wp:effectExtent b="0" l="0" r="0" t="0"/>
-            <wp:docPr id="45" name="image1.png"/>
+            <wp:docPr id="45" name="image19.png"/>
             <a:graphic>
               <a:graphicData uri="http://schemas.openxmlformats.org/drawingml/2006/picture">
                 <pic:pic>
                   <pic:nvPicPr>
-                    <pic:cNvPr id="0" name="image1.png"/>
+                    <pic:cNvPr id="0" name="image19.png"/>
                     <pic:cNvPicPr preferRelativeResize="0"/>
                   </pic:nvPicPr>
                   <pic:blipFill>
@@ -14908,12 +14908,12 @@
           <wp:inline distB="114300" distT="114300" distL="114300" distR="114300">
             <wp:extent cx="3200400" cy="2231733"/>
             <wp:effectExtent b="0" l="0" r="0" t="0"/>
-            <wp:docPr id="27" name="image26.png"/>
+            <wp:docPr id="27" name="image15.png"/>
             <a:graphic>
               <a:graphicData uri="http://schemas.openxmlformats.org/drawingml/2006/picture">
                 <pic:pic>
                   <pic:nvPicPr>
-                    <pic:cNvPr id="0" name="image26.png"/>
+                    <pic:cNvPr id="0" name="image15.png"/>
                     <pic:cNvPicPr preferRelativeResize="0"/>
                   </pic:nvPicPr>
                   <pic:blipFill>
@@ -15019,12 +15019,12 @@
           <wp:inline distB="114300" distT="114300" distL="114300" distR="114300">
             <wp:extent cx="5176838" cy="989690"/>
             <wp:effectExtent b="0" l="0" r="0" t="0"/>
-            <wp:docPr id="46" name="image43.png"/>
+            <wp:docPr id="46" name="image35.png"/>
             <a:graphic>
               <a:graphicData uri="http://schemas.openxmlformats.org/drawingml/2006/picture">
                 <pic:pic>
                   <pic:nvPicPr>
-                    <pic:cNvPr id="0" name="image43.png"/>
+                    <pic:cNvPr id="0" name="image35.png"/>
                     <pic:cNvPicPr preferRelativeResize="0"/>
                   </pic:nvPicPr>
                   <pic:blipFill>
@@ -15147,12 +15147,12 @@
           <wp:inline distB="114300" distT="114300" distL="114300" distR="114300">
             <wp:extent cx="2605193" cy="1762058"/>
             <wp:effectExtent b="0" l="0" r="0" t="0"/>
-            <wp:docPr id="31" name="image27.png"/>
+            <wp:docPr id="31" name="image14.png"/>
             <a:graphic>
               <a:graphicData uri="http://schemas.openxmlformats.org/drawingml/2006/picture">
                 <pic:pic>
                   <pic:nvPicPr>
-                    <pic:cNvPr id="0" name="image27.png"/>
+                    <pic:cNvPr id="0" name="image14.png"/>
                     <pic:cNvPicPr preferRelativeResize="0"/>
                   </pic:nvPicPr>
                   <pic:blipFill>
@@ -15261,12 +15261,12 @@
           <wp:inline distB="114300" distT="114300" distL="114300" distR="114300">
             <wp:extent cx="4041430" cy="828244"/>
             <wp:effectExtent b="0" l="0" r="0" t="0"/>
-            <wp:docPr id="22" name="image16.png"/>
+            <wp:docPr id="22" name="image4.png"/>
             <a:graphic>
               <a:graphicData uri="http://schemas.openxmlformats.org/drawingml/2006/picture">
                 <pic:pic>
                   <pic:nvPicPr>
-                    <pic:cNvPr id="0" name="image16.png"/>
+                    <pic:cNvPr id="0" name="image4.png"/>
                     <pic:cNvPicPr preferRelativeResize="0"/>
                   </pic:nvPicPr>
                   <pic:blipFill>
@@ -15463,12 +15463,12 @@
                 <wp:inline distB="114300" distT="114300" distL="114300" distR="114300">
                   <wp:extent cx="2633663" cy="2162175"/>
                   <wp:effectExtent b="0" l="0" r="0" t="0"/>
-                  <wp:docPr id="39" name="image35.png"/>
+                  <wp:docPr id="39" name="image22.png"/>
                   <a:graphic>
                     <a:graphicData uri="http://schemas.openxmlformats.org/drawingml/2006/picture">
                       <pic:pic>
                         <pic:nvPicPr>
-                          <pic:cNvPr id="0" name="image35.png"/>
+                          <pic:cNvPr id="0" name="image22.png"/>
                           <pic:cNvPicPr preferRelativeResize="0"/>
                         </pic:nvPicPr>
                         <pic:blipFill>
@@ -15550,12 +15550,12 @@
                 <wp:inline distB="114300" distT="114300" distL="114300" distR="114300">
                   <wp:extent cx="2528888" cy="1990725"/>
                   <wp:effectExtent b="0" l="0" r="0" t="0"/>
-                  <wp:docPr id="30" name="image25.png"/>
+                  <wp:docPr id="30" name="image11.png"/>
                   <a:graphic>
                     <a:graphicData uri="http://schemas.openxmlformats.org/drawingml/2006/picture">
                       <pic:pic>
                         <pic:nvPicPr>
-                          <pic:cNvPr id="0" name="image25.png"/>
+                          <pic:cNvPr id="0" name="image11.png"/>
                           <pic:cNvPicPr preferRelativeResize="0"/>
                         </pic:nvPicPr>
                         <pic:blipFill>
@@ -15668,12 +15668,12 @@
           <wp:inline distB="114300" distT="114300" distL="114300" distR="114300">
             <wp:extent cx="5591175" cy="2401026"/>
             <wp:effectExtent b="0" l="0" r="0" t="0"/>
-            <wp:docPr id="38" name="image34.png"/>
+            <wp:docPr id="38" name="image28.png"/>
             <a:graphic>
               <a:graphicData uri="http://schemas.openxmlformats.org/drawingml/2006/picture">
                 <pic:pic>
                   <pic:nvPicPr>
-                    <pic:cNvPr id="0" name="image34.png"/>
+                    <pic:cNvPr id="0" name="image28.png"/>
                     <pic:cNvPicPr preferRelativeResize="0"/>
                   </pic:nvPicPr>
                   <pic:blipFill>
@@ -18057,12 +18057,12 @@
           <wp:inline distB="114300" distT="114300" distL="114300" distR="114300">
             <wp:extent cx="4886325" cy="2770499"/>
             <wp:effectExtent b="0" l="0" r="0" t="0"/>
-            <wp:docPr id="35" name="image31.jpg"/>
+            <wp:docPr id="35" name="image29.jpg"/>
             <a:graphic>
               <a:graphicData uri="http://schemas.openxmlformats.org/drawingml/2006/picture">
                 <pic:pic>
                   <pic:nvPicPr>
-                    <pic:cNvPr id="0" name="image31.jpg"/>
+                    <pic:cNvPr id="0" name="image29.jpg"/>
                     <pic:cNvPicPr preferRelativeResize="0"/>
                   </pic:nvPicPr>
                   <pic:blipFill>
@@ -18921,12 +18921,12 @@
                 <wp:inline distB="114300" distT="114300" distL="114300" distR="114300">
                   <wp:extent cx="3138488" cy="1221053"/>
                   <wp:effectExtent b="0" l="0" r="0" t="0"/>
-                  <wp:docPr id="26" name="image22.png"/>
+                  <wp:docPr id="26" name="image23.png"/>
                   <a:graphic>
                     <a:graphicData uri="http://schemas.openxmlformats.org/drawingml/2006/picture">
                       <pic:pic>
                         <pic:nvPicPr>
-                          <pic:cNvPr id="0" name="image22.png"/>
+                          <pic:cNvPr id="0" name="image23.png"/>
                           <pic:cNvPicPr preferRelativeResize="0"/>
                         </pic:nvPicPr>
                         <pic:blipFill>
@@ -19158,12 +19158,12 @@
                 <wp:inline distB="114300" distT="114300" distL="114300" distR="114300">
                   <wp:extent cx="2105025" cy="1473200"/>
                   <wp:effectExtent b="0" l="0" r="0" t="0"/>
-                  <wp:docPr id="17" name="image10.png"/>
+                  <wp:docPr id="17" name="image9.png"/>
                   <a:graphic>
                     <a:graphicData uri="http://schemas.openxmlformats.org/drawingml/2006/picture">
                       <pic:pic>
                         <pic:nvPicPr>
-                          <pic:cNvPr id="0" name="image10.png"/>
+                          <pic:cNvPr id="0" name="image9.png"/>
                           <pic:cNvPicPr preferRelativeResize="0"/>
                         </pic:nvPicPr>
                         <pic:blipFill>
@@ -19245,12 +19245,12 @@
                 <wp:inline distB="114300" distT="114300" distL="114300" distR="114300">
                   <wp:extent cx="3137643" cy="1286434"/>
                   <wp:effectExtent b="0" l="0" r="0" t="0"/>
-                  <wp:docPr id="42" name="image38.png"/>
+                  <wp:docPr id="42" name="image33.png"/>
                   <a:graphic>
                     <a:graphicData uri="http://schemas.openxmlformats.org/drawingml/2006/picture">
                       <pic:pic>
                         <pic:nvPicPr>
-                          <pic:cNvPr id="0" name="image38.png"/>
+                          <pic:cNvPr id="0" name="image33.png"/>
                           <pic:cNvPicPr preferRelativeResize="0"/>
                         </pic:nvPicPr>
                         <pic:blipFill>
@@ -19498,12 +19498,12 @@
                 <wp:inline distB="114300" distT="114300" distL="114300" distR="114300">
                   <wp:extent cx="2105025" cy="1447800"/>
                   <wp:effectExtent b="0" l="0" r="0" t="0"/>
-                  <wp:docPr id="25" name="image21.png"/>
+                  <wp:docPr id="25" name="image12.png"/>
                   <a:graphic>
                     <a:graphicData uri="http://schemas.openxmlformats.org/drawingml/2006/picture">
                       <pic:pic>
                         <pic:nvPicPr>
-                          <pic:cNvPr id="0" name="image21.png"/>
+                          <pic:cNvPr id="0" name="image12.png"/>
                           <pic:cNvPicPr preferRelativeResize="0"/>
                         </pic:nvPicPr>
                         <pic:blipFill>
@@ -19585,12 +19585,12 @@
                 <wp:inline distB="114300" distT="114300" distL="114300" distR="114300">
                   <wp:extent cx="3112880" cy="1309688"/>
                   <wp:effectExtent b="0" l="0" r="0" t="0"/>
-                  <wp:docPr id="24" name="image20.png"/>
+                  <wp:docPr id="24" name="image27.png"/>
                   <a:graphic>
                     <a:graphicData uri="http://schemas.openxmlformats.org/drawingml/2006/picture">
                       <pic:pic>
                         <pic:nvPicPr>
-                          <pic:cNvPr id="0" name="image20.png"/>
+                          <pic:cNvPr id="0" name="image27.png"/>
                           <pic:cNvPicPr preferRelativeResize="0"/>
                         </pic:nvPicPr>
                         <pic:blipFill>
@@ -19892,12 +19892,12 @@
                 <wp:inline distB="114300" distT="114300" distL="114300" distR="114300">
                   <wp:extent cx="2603224" cy="1700261"/>
                   <wp:effectExtent b="0" l="0" r="0" t="0"/>
-                  <wp:docPr id="28" name="image23.png"/>
+                  <wp:docPr id="28" name="image21.png"/>
                   <a:graphic>
                     <a:graphicData uri="http://schemas.openxmlformats.org/drawingml/2006/picture">
                       <pic:pic>
                         <pic:nvPicPr>
-                          <pic:cNvPr id="0" name="image23.png"/>
+                          <pic:cNvPr id="0" name="image21.png"/>
                           <pic:cNvPicPr preferRelativeResize="0"/>
                         </pic:nvPicPr>
                         <pic:blipFill>
@@ -19979,12 +19979,12 @@
                 <wp:inline distB="114300" distT="114300" distL="114300" distR="114300">
                   <wp:extent cx="2576513" cy="1730213"/>
                   <wp:effectExtent b="0" l="0" r="0" t="0"/>
-                  <wp:docPr id="41" name="image40.png"/>
+                  <wp:docPr id="41" name="image31.png"/>
                   <a:graphic>
                     <a:graphicData uri="http://schemas.openxmlformats.org/drawingml/2006/picture">
                       <pic:pic>
                         <pic:nvPicPr>
-                          <pic:cNvPr id="0" name="image40.png"/>
+                          <pic:cNvPr id="0" name="image31.png"/>
                           <pic:cNvPicPr preferRelativeResize="0"/>
                         </pic:nvPicPr>
                         <pic:blipFill>
@@ -20236,12 +20236,12 @@
                 <wp:inline distB="114300" distT="114300" distL="114300" distR="114300">
                   <wp:extent cx="2627222" cy="1738313"/>
                   <wp:effectExtent b="0" l="0" r="0" t="0"/>
-                  <wp:docPr id="44" name="image39.png"/>
+                  <wp:docPr id="44" name="image37.png"/>
                   <a:graphic>
                     <a:graphicData uri="http://schemas.openxmlformats.org/drawingml/2006/picture">
                       <pic:pic>
                         <pic:nvPicPr>
-                          <pic:cNvPr id="0" name="image39.png"/>
+                          <pic:cNvPr id="0" name="image37.png"/>
                           <pic:cNvPicPr preferRelativeResize="0"/>
                         </pic:nvPicPr>
                         <pic:blipFill>
@@ -20323,12 +20323,12 @@
                 <wp:inline distB="114300" distT="114300" distL="114300" distR="114300">
                   <wp:extent cx="2595563" cy="1736533"/>
                   <wp:effectExtent b="0" l="0" r="0" t="0"/>
-                  <wp:docPr id="43" name="image37.png"/>
+                  <wp:docPr id="43" name="image38.png"/>
                   <a:graphic>
                     <a:graphicData uri="http://schemas.openxmlformats.org/drawingml/2006/picture">
                       <pic:pic>
                         <pic:nvPicPr>
-                          <pic:cNvPr id="0" name="image37.png"/>
+                          <pic:cNvPr id="0" name="image38.png"/>
                           <pic:cNvPicPr preferRelativeResize="0"/>
                         </pic:nvPicPr>
                         <pic:blipFill>
@@ -22905,12 +22905,12 @@
           <wp:inline distB="114300" distT="114300" distL="114300" distR="114300">
             <wp:extent cx="5957888" cy="2837538"/>
             <wp:effectExtent b="0" l="0" r="0" t="0"/>
-            <wp:docPr id="23" name="image17.png"/>
+            <wp:docPr id="23" name="image5.png"/>
             <a:graphic>
               <a:graphicData uri="http://schemas.openxmlformats.org/drawingml/2006/picture">
                 <pic:pic>
                   <pic:nvPicPr>
-                    <pic:cNvPr id="0" name="image17.png"/>
+                    <pic:cNvPr id="0" name="image5.png"/>
                     <pic:cNvPicPr preferRelativeResize="0"/>
                   </pic:nvPicPr>
                   <pic:blipFill>
@@ -23018,9 +23018,10 @@
             <w:color w:val="1155cc"/>
             <w:sz w:val="24"/>
             <w:szCs w:val="24"/>
+            <w:u w:val="single"/>
             <w:rtl w:val="0"/>
           </w:rPr>
-          <w:t xml:space="preserve">https://github.com/StrikerAbir/Steel-Decfect-Detection-with-High-Frequency-Camera</w:t>
+          <w:t xml:space="preserve">https://github.com/StrikerAbir/COMPARATIVE-PERFORMANCE-ANALYSIS-OF-FIVE-ML-TECHNIQUES-ON-CLASSIFYING-DEFECTS-IN-STEEL-SHEETS</w:t>
         </w:r>
       </w:hyperlink>
       <w:r>
@@ -23094,12 +23095,12 @@
           <wp:inline distB="114300" distT="114300" distL="114300" distR="114300">
             <wp:extent cx="5200650" cy="5815160"/>
             <wp:effectExtent b="0" l="0" r="0" t="0"/>
-            <wp:docPr id="16" name="image11.png"/>
+            <wp:docPr id="16" name="image10.png"/>
             <a:graphic>
               <a:graphicData uri="http://schemas.openxmlformats.org/drawingml/2006/picture">
                 <pic:pic>
                   <pic:nvPicPr>
-                    <pic:cNvPr id="0" name="image11.png"/>
+                    <pic:cNvPr id="0" name="image10.png"/>
                     <pic:cNvPicPr preferRelativeResize="0"/>
                   </pic:nvPicPr>
                   <pic:blipFill>

</xml_diff>

<commit_message>
Remove unnecessary blank lines in thesis documents for improved formatting
</commit_message>
<xml_diff>
--- a/Comparative Performance Analysis Thesis Book.docx
+++ b/Comparative Performance Analysis Thesis Book.docx
@@ -250,12 +250,12 @@
           <wp:inline distB="0" distT="0" distL="0" distR="0">
             <wp:extent cx="1581641" cy="1553619"/>
             <wp:effectExtent b="0" l="0" r="0" t="0"/>
-            <wp:docPr id="12" name="image2.png"/>
+            <wp:docPr id="12" name="image33.png"/>
             <a:graphic>
               <a:graphicData uri="http://schemas.openxmlformats.org/drawingml/2006/picture">
                 <pic:pic>
                   <pic:nvPicPr>
-                    <pic:cNvPr id="0" name="image2.png"/>
+                    <pic:cNvPr id="0" name="image33.png"/>
                     <pic:cNvPicPr preferRelativeResize="0"/>
                   </pic:nvPicPr>
                   <pic:blipFill>
@@ -4140,24 +4140,6 @@
     </w:p>
     <w:p>
       <w:pPr>
-        <w:spacing w:after="200" w:line="360" w:lineRule="auto"/>
-        <w:rPr>
-          <w:rFonts w:ascii="Times New Roman" w:cs="Times New Roman" w:eastAsia="Times New Roman" w:hAnsi="Times New Roman"/>
-          <w:b w:val="1"/>
-          <w:bCs w:val="1"/>
-          <w:color w:val="111111"/>
-          <w:sz w:val="28"/>
-          <w:szCs w:val="28"/>
-        </w:rPr>
-      </w:pPr>
-      <w:r>
-        <w:rPr>
-          <w:rtl w:val="0"/>
-        </w:rPr>
-      </w:r>
-    </w:p>
-    <w:p>
-      <w:pPr>
         <w:tabs>
           <w:tab w:val="left" w:leader="none" w:pos="6723"/>
         </w:tabs>
@@ -4189,7 +4171,7 @@
     </w:p>
     <w:sdt>
       <w:sdtPr>
-        <w:id w:val="-1467901316"/>
+        <w:id w:val="-1692910164"/>
         <w:docPartObj>
           <w:docPartGallery w:val="Table of Contents"/>
           <w:docPartUnique w:val="1"/>
@@ -10435,12 +10417,12 @@
           <wp:inline distB="114300" distT="114300" distL="114300" distR="114300">
             <wp:extent cx="4029075" cy="1245522"/>
             <wp:effectExtent b="0" l="0" r="0" t="0"/>
-            <wp:docPr id="33" name="image24.png"/>
+            <wp:docPr id="33" name="image19.png"/>
             <a:graphic>
               <a:graphicData uri="http://schemas.openxmlformats.org/drawingml/2006/picture">
                 <pic:pic>
                   <pic:nvPicPr>
-                    <pic:cNvPr id="0" name="image24.png"/>
+                    <pic:cNvPr id="0" name="image19.png"/>
                     <pic:cNvPicPr preferRelativeResize="0"/>
                   </pic:nvPicPr>
                   <pic:blipFill>
@@ -12678,12 +12660,12 @@
           <wp:inline distB="114300" distT="114300" distL="114300" distR="114300">
             <wp:extent cx="1666875" cy="3402883"/>
             <wp:effectExtent b="0" l="0" r="0" t="0"/>
-            <wp:docPr id="47" name="image34.png"/>
+            <wp:docPr id="47" name="image31.png"/>
             <a:graphic>
               <a:graphicData uri="http://schemas.openxmlformats.org/drawingml/2006/picture">
                 <pic:pic>
                   <pic:nvPicPr>
-                    <pic:cNvPr id="0" name="image34.png"/>
+                    <pic:cNvPr id="0" name="image31.png"/>
                     <pic:cNvPicPr preferRelativeResize="0"/>
                   </pic:nvPicPr>
                   <pic:blipFill>
@@ -12780,12 +12762,12 @@
           <wp:inline distB="114300" distT="114300" distL="114300" distR="114300">
             <wp:extent cx="5366594" cy="3371931"/>
             <wp:effectExtent b="0" l="0" r="0" t="0"/>
-            <wp:docPr id="14" name="image16.png"/>
+            <wp:docPr id="14" name="image4.png"/>
             <a:graphic>
               <a:graphicData uri="http://schemas.openxmlformats.org/drawingml/2006/picture">
                 <pic:pic>
                   <pic:nvPicPr>
-                    <pic:cNvPr id="0" name="image16.png"/>
+                    <pic:cNvPr id="0" name="image4.png"/>
                     <pic:cNvPicPr preferRelativeResize="0"/>
                   </pic:nvPicPr>
                   <pic:blipFill>
@@ -12876,12 +12858,12 @@
           <wp:inline distB="114300" distT="114300" distL="114300" distR="114300">
             <wp:extent cx="5186363" cy="3284065"/>
             <wp:effectExtent b="0" l="0" r="0" t="0"/>
-            <wp:docPr id="32" name="image30.png"/>
+            <wp:docPr id="32" name="image14.png"/>
             <a:graphic>
               <a:graphicData uri="http://schemas.openxmlformats.org/drawingml/2006/picture">
                 <pic:pic>
                   <pic:nvPicPr>
-                    <pic:cNvPr id="0" name="image30.png"/>
+                    <pic:cNvPr id="0" name="image14.png"/>
                     <pic:cNvPicPr preferRelativeResize="0"/>
                   </pic:nvPicPr>
                   <pic:blipFill>
@@ -13299,12 +13281,12 @@
           <wp:inline distB="114300" distT="114300" distL="114300" distR="114300">
             <wp:extent cx="5324475" cy="1262796"/>
             <wp:effectExtent b="0" l="0" r="0" t="0"/>
-            <wp:docPr id="18" name="image18.png"/>
+            <wp:docPr id="18" name="image5.png"/>
             <a:graphic>
               <a:graphicData uri="http://schemas.openxmlformats.org/drawingml/2006/picture">
                 <pic:pic>
                   <pic:nvPicPr>
-                    <pic:cNvPr id="0" name="image18.png"/>
+                    <pic:cNvPr id="0" name="image5.png"/>
                     <pic:cNvPicPr preferRelativeResize="0"/>
                   </pic:nvPicPr>
                   <pic:blipFill>
@@ -13439,12 +13421,12 @@
           <wp:inline distB="114300" distT="114300" distL="114300" distR="114300">
             <wp:extent cx="3486150" cy="2557463"/>
             <wp:effectExtent b="0" l="0" r="0" t="0"/>
-            <wp:docPr id="37" name="image36.png"/>
+            <wp:docPr id="37" name="image25.png"/>
             <a:graphic>
               <a:graphicData uri="http://schemas.openxmlformats.org/drawingml/2006/picture">
                 <pic:pic>
                   <pic:nvPicPr>
-                    <pic:cNvPr id="0" name="image36.png"/>
+                    <pic:cNvPr id="0" name="image25.png"/>
                     <pic:cNvPicPr preferRelativeResize="0"/>
                   </pic:nvPicPr>
                   <pic:blipFill>
@@ -13621,12 +13603,12 @@
           <wp:inline distB="114300" distT="114300" distL="114300" distR="114300">
             <wp:extent cx="3976688" cy="2951373"/>
             <wp:effectExtent b="0" l="0" r="0" t="0"/>
-            <wp:docPr id="10" name="image13.png"/>
+            <wp:docPr id="10" name="image26.png"/>
             <a:graphic>
               <a:graphicData uri="http://schemas.openxmlformats.org/drawingml/2006/picture">
                 <pic:pic>
                   <pic:nvPicPr>
-                    <pic:cNvPr id="0" name="image13.png"/>
+                    <pic:cNvPr id="0" name="image26.png"/>
                     <pic:cNvPicPr preferRelativeResize="0"/>
                   </pic:nvPicPr>
                   <pic:blipFill>
@@ -13778,12 +13760,12 @@
           <wp:inline distB="114300" distT="114300" distL="114300" distR="114300">
             <wp:extent cx="2645981" cy="465227"/>
             <wp:effectExtent b="0" l="0" r="0" t="0"/>
-            <wp:docPr id="29" name="image17.png"/>
+            <wp:docPr id="29" name="image22.png"/>
             <a:graphic>
               <a:graphicData uri="http://schemas.openxmlformats.org/drawingml/2006/picture">
                 <pic:pic>
                   <pic:nvPicPr>
-                    <pic:cNvPr id="0" name="image17.png"/>
+                    <pic:cNvPr id="0" name="image22.png"/>
                     <pic:cNvPicPr preferRelativeResize="0"/>
                   </pic:nvPicPr>
                   <pic:blipFill>
@@ -13881,12 +13863,12 @@
           <wp:inline distB="114300" distT="114300" distL="114300" distR="114300">
             <wp:extent cx="3475149" cy="624959"/>
             <wp:effectExtent b="0" l="0" r="0" t="0"/>
-            <wp:docPr id="20" name="image6.png"/>
+            <wp:docPr id="20" name="image1.png"/>
             <a:graphic>
               <a:graphicData uri="http://schemas.openxmlformats.org/drawingml/2006/picture">
                 <pic:pic>
                   <pic:nvPicPr>
-                    <pic:cNvPr id="0" name="image6.png"/>
+                    <pic:cNvPr id="0" name="image1.png"/>
                     <pic:cNvPicPr preferRelativeResize="0"/>
                   </pic:nvPicPr>
                   <pic:blipFill>
@@ -13988,12 +13970,12 @@
           <wp:inline distB="114300" distT="114300" distL="114300" distR="114300">
             <wp:extent cx="5424488" cy="1548513"/>
             <wp:effectExtent b="0" l="0" r="0" t="0"/>
-            <wp:docPr id="13" name="image8.png"/>
+            <wp:docPr id="13" name="image15.png"/>
             <a:graphic>
               <a:graphicData uri="http://schemas.openxmlformats.org/drawingml/2006/picture">
                 <pic:pic>
                   <pic:nvPicPr>
-                    <pic:cNvPr id="0" name="image8.png"/>
+                    <pic:cNvPr id="0" name="image15.png"/>
                     <pic:cNvPicPr preferRelativeResize="0"/>
                   </pic:nvPicPr>
                   <pic:blipFill>
@@ -14106,12 +14088,12 @@
           <wp:inline distB="114300" distT="114300" distL="114300" distR="114300">
             <wp:extent cx="2647777" cy="738228"/>
             <wp:effectExtent b="0" l="0" r="0" t="0"/>
-            <wp:docPr id="15" name="image1.png"/>
+            <wp:docPr id="15" name="image12.png"/>
             <a:graphic>
               <a:graphicData uri="http://schemas.openxmlformats.org/drawingml/2006/picture">
                 <pic:pic>
                   <pic:nvPicPr>
-                    <pic:cNvPr id="0" name="image1.png"/>
+                    <pic:cNvPr id="0" name="image12.png"/>
                     <pic:cNvPicPr preferRelativeResize="0"/>
                   </pic:nvPicPr>
                   <pic:blipFill>
@@ -14224,12 +14206,12 @@
           <wp:inline distB="114300" distT="114300" distL="114300" distR="114300">
             <wp:extent cx="5572125" cy="542418"/>
             <wp:effectExtent b="0" l="0" r="0" t="0"/>
-            <wp:docPr id="21" name="image3.png"/>
+            <wp:docPr id="21" name="image6.png"/>
             <a:graphic>
               <a:graphicData uri="http://schemas.openxmlformats.org/drawingml/2006/picture">
                 <pic:pic>
                   <pic:nvPicPr>
-                    <pic:cNvPr id="0" name="image3.png"/>
+                    <pic:cNvPr id="0" name="image6.png"/>
                     <pic:cNvPicPr preferRelativeResize="0"/>
                   </pic:nvPicPr>
                   <pic:blipFill>
@@ -14389,12 +14371,12 @@
           <wp:inline distB="114300" distT="114300" distL="114300" distR="114300">
             <wp:extent cx="4862513" cy="1589304"/>
             <wp:effectExtent b="0" l="0" r="0" t="0"/>
-            <wp:docPr id="40" name="image25.png"/>
+            <wp:docPr id="40" name="image27.png"/>
             <a:graphic>
               <a:graphicData uri="http://schemas.openxmlformats.org/drawingml/2006/picture">
                 <pic:pic>
                   <pic:nvPicPr>
-                    <pic:cNvPr id="0" name="image25.png"/>
+                    <pic:cNvPr id="0" name="image27.png"/>
                     <pic:cNvPicPr preferRelativeResize="0"/>
                   </pic:nvPicPr>
                   <pic:blipFill>
@@ -14507,12 +14489,12 @@
           <wp:inline distB="114300" distT="114300" distL="114300" distR="114300">
             <wp:extent cx="5019675" cy="2602074"/>
             <wp:effectExtent b="0" l="0" r="0" t="0"/>
-            <wp:docPr id="11" name="image7.png"/>
+            <wp:docPr id="11" name="image17.png"/>
             <a:graphic>
               <a:graphicData uri="http://schemas.openxmlformats.org/drawingml/2006/picture">
                 <pic:pic>
                   <pic:nvPicPr>
-                    <pic:cNvPr id="0" name="image7.png"/>
+                    <pic:cNvPr id="0" name="image17.png"/>
                     <pic:cNvPicPr preferRelativeResize="0"/>
                   </pic:nvPicPr>
                   <pic:blipFill>
@@ -14609,12 +14591,12 @@
           <wp:inline distB="114300" distT="114300" distL="114300" distR="114300">
             <wp:extent cx="5567933" cy="3833813"/>
             <wp:effectExtent b="0" l="0" r="0" t="0"/>
-            <wp:docPr id="34" name="image26.png"/>
+            <wp:docPr id="34" name="image18.png"/>
             <a:graphic>
               <a:graphicData uri="http://schemas.openxmlformats.org/drawingml/2006/picture">
                 <pic:pic>
                   <pic:nvPicPr>
-                    <pic:cNvPr id="0" name="image26.png"/>
+                    <pic:cNvPr id="0" name="image18.png"/>
                     <pic:cNvPicPr preferRelativeResize="0"/>
                   </pic:nvPicPr>
                   <pic:blipFill>
@@ -14724,12 +14706,12 @@
           <wp:inline distB="114300" distT="114300" distL="114300" distR="114300">
             <wp:extent cx="5529263" cy="447675"/>
             <wp:effectExtent b="0" l="0" r="0" t="0"/>
-            <wp:docPr id="9" name="image19.png"/>
+            <wp:docPr id="9" name="image11.png"/>
             <a:graphic>
               <a:graphicData uri="http://schemas.openxmlformats.org/drawingml/2006/picture">
                 <pic:pic>
                   <pic:nvPicPr>
-                    <pic:cNvPr id="0" name="image19.png"/>
+                    <pic:cNvPr id="0" name="image11.png"/>
                     <pic:cNvPicPr preferRelativeResize="0"/>
                   </pic:nvPicPr>
                   <pic:blipFill>
@@ -14780,12 +14762,12 @@
           <wp:inline distB="114300" distT="114300" distL="114300" distR="114300">
             <wp:extent cx="4553644" cy="2418209"/>
             <wp:effectExtent b="0" l="0" r="0" t="0"/>
-            <wp:docPr id="45" name="image19.png"/>
+            <wp:docPr id="45" name="image11.png"/>
             <a:graphic>
               <a:graphicData uri="http://schemas.openxmlformats.org/drawingml/2006/picture">
                 <pic:pic>
                   <pic:nvPicPr>
-                    <pic:cNvPr id="0" name="image19.png"/>
+                    <pic:cNvPr id="0" name="image11.png"/>
                     <pic:cNvPicPr preferRelativeResize="0"/>
                   </pic:nvPicPr>
                   <pic:blipFill>
@@ -14908,12 +14890,12 @@
           <wp:inline distB="114300" distT="114300" distL="114300" distR="114300">
             <wp:extent cx="3200400" cy="2231733"/>
             <wp:effectExtent b="0" l="0" r="0" t="0"/>
-            <wp:docPr id="27" name="image15.png"/>
+            <wp:docPr id="27" name="image32.png"/>
             <a:graphic>
               <a:graphicData uri="http://schemas.openxmlformats.org/drawingml/2006/picture">
                 <pic:pic>
                   <pic:nvPicPr>
-                    <pic:cNvPr id="0" name="image15.png"/>
+                    <pic:cNvPr id="0" name="image32.png"/>
                     <pic:cNvPicPr preferRelativeResize="0"/>
                   </pic:nvPicPr>
                   <pic:blipFill>
@@ -15019,12 +15001,12 @@
           <wp:inline distB="114300" distT="114300" distL="114300" distR="114300">
             <wp:extent cx="5176838" cy="989690"/>
             <wp:effectExtent b="0" l="0" r="0" t="0"/>
-            <wp:docPr id="46" name="image35.png"/>
+            <wp:docPr id="46" name="image34.png"/>
             <a:graphic>
               <a:graphicData uri="http://schemas.openxmlformats.org/drawingml/2006/picture">
                 <pic:pic>
                   <pic:nvPicPr>
-                    <pic:cNvPr id="0" name="image35.png"/>
+                    <pic:cNvPr id="0" name="image34.png"/>
                     <pic:cNvPicPr preferRelativeResize="0"/>
                   </pic:nvPicPr>
                   <pic:blipFill>
@@ -15147,12 +15129,12 @@
           <wp:inline distB="114300" distT="114300" distL="114300" distR="114300">
             <wp:extent cx="2605193" cy="1762058"/>
             <wp:effectExtent b="0" l="0" r="0" t="0"/>
-            <wp:docPr id="31" name="image14.png"/>
+            <wp:docPr id="31" name="image16.png"/>
             <a:graphic>
               <a:graphicData uri="http://schemas.openxmlformats.org/drawingml/2006/picture">
                 <pic:pic>
                   <pic:nvPicPr>
-                    <pic:cNvPr id="0" name="image14.png"/>
+                    <pic:cNvPr id="0" name="image16.png"/>
                     <pic:cNvPicPr preferRelativeResize="0"/>
                   </pic:nvPicPr>
                   <pic:blipFill>
@@ -15261,12 +15243,12 @@
           <wp:inline distB="114300" distT="114300" distL="114300" distR="114300">
             <wp:extent cx="4041430" cy="828244"/>
             <wp:effectExtent b="0" l="0" r="0" t="0"/>
-            <wp:docPr id="22" name="image4.png"/>
+            <wp:docPr id="22" name="image23.png"/>
             <a:graphic>
               <a:graphicData uri="http://schemas.openxmlformats.org/drawingml/2006/picture">
                 <pic:pic>
                   <pic:nvPicPr>
-                    <pic:cNvPr id="0" name="image4.png"/>
+                    <pic:cNvPr id="0" name="image23.png"/>
                     <pic:cNvPicPr preferRelativeResize="0"/>
                   </pic:nvPicPr>
                   <pic:blipFill>
@@ -15463,12 +15445,12 @@
                 <wp:inline distB="114300" distT="114300" distL="114300" distR="114300">
                   <wp:extent cx="2633663" cy="2162175"/>
                   <wp:effectExtent b="0" l="0" r="0" t="0"/>
-                  <wp:docPr id="39" name="image22.png"/>
+                  <wp:docPr id="39" name="image37.png"/>
                   <a:graphic>
                     <a:graphicData uri="http://schemas.openxmlformats.org/drawingml/2006/picture">
                       <pic:pic>
                         <pic:nvPicPr>
-                          <pic:cNvPr id="0" name="image22.png"/>
+                          <pic:cNvPr id="0" name="image37.png"/>
                           <pic:cNvPicPr preferRelativeResize="0"/>
                         </pic:nvPicPr>
                         <pic:blipFill>
@@ -15550,12 +15532,12 @@
                 <wp:inline distB="114300" distT="114300" distL="114300" distR="114300">
                   <wp:extent cx="2528888" cy="1990725"/>
                   <wp:effectExtent b="0" l="0" r="0" t="0"/>
-                  <wp:docPr id="30" name="image11.png"/>
+                  <wp:docPr id="30" name="image13.png"/>
                   <a:graphic>
                     <a:graphicData uri="http://schemas.openxmlformats.org/drawingml/2006/picture">
                       <pic:pic>
                         <pic:nvPicPr>
-                          <pic:cNvPr id="0" name="image11.png"/>
+                          <pic:cNvPr id="0" name="image13.png"/>
                           <pic:cNvPicPr preferRelativeResize="0"/>
                         </pic:nvPicPr>
                         <pic:blipFill>
@@ -15668,12 +15650,12 @@
           <wp:inline distB="114300" distT="114300" distL="114300" distR="114300">
             <wp:extent cx="5591175" cy="2401026"/>
             <wp:effectExtent b="0" l="0" r="0" t="0"/>
-            <wp:docPr id="38" name="image28.png"/>
+            <wp:docPr id="38" name="image35.png"/>
             <a:graphic>
               <a:graphicData uri="http://schemas.openxmlformats.org/drawingml/2006/picture">
                 <pic:pic>
                   <pic:nvPicPr>
-                    <pic:cNvPr id="0" name="image28.png"/>
+                    <pic:cNvPr id="0" name="image35.png"/>
                     <pic:cNvPicPr preferRelativeResize="0"/>
                   </pic:nvPicPr>
                   <pic:blipFill>
@@ -18057,12 +18039,12 @@
           <wp:inline distB="114300" distT="114300" distL="114300" distR="114300">
             <wp:extent cx="4886325" cy="2770499"/>
             <wp:effectExtent b="0" l="0" r="0" t="0"/>
-            <wp:docPr id="35" name="image29.jpg"/>
+            <wp:docPr id="35" name="image38.jpg"/>
             <a:graphic>
               <a:graphicData uri="http://schemas.openxmlformats.org/drawingml/2006/picture">
                 <pic:pic>
                   <pic:nvPicPr>
-                    <pic:cNvPr id="0" name="image29.jpg"/>
+                    <pic:cNvPr id="0" name="image38.jpg"/>
                     <pic:cNvPicPr preferRelativeResize="0"/>
                   </pic:nvPicPr>
                   <pic:blipFill>
@@ -18834,12 +18816,12 @@
                 <wp:inline distB="114300" distT="114300" distL="114300" distR="114300">
                   <wp:extent cx="2081213" cy="1432027"/>
                   <wp:effectExtent b="0" l="0" r="0" t="0"/>
-                  <wp:docPr id="36" name="image32.png"/>
+                  <wp:docPr id="36" name="image21.png"/>
                   <a:graphic>
                     <a:graphicData uri="http://schemas.openxmlformats.org/drawingml/2006/picture">
                       <pic:pic>
                         <pic:nvPicPr>
-                          <pic:cNvPr id="0" name="image32.png"/>
+                          <pic:cNvPr id="0" name="image21.png"/>
                           <pic:cNvPicPr preferRelativeResize="0"/>
                         </pic:nvPicPr>
                         <pic:blipFill>
@@ -18921,12 +18903,12 @@
                 <wp:inline distB="114300" distT="114300" distL="114300" distR="114300">
                   <wp:extent cx="3138488" cy="1221053"/>
                   <wp:effectExtent b="0" l="0" r="0" t="0"/>
-                  <wp:docPr id="26" name="image23.png"/>
+                  <wp:docPr id="26" name="image10.png"/>
                   <a:graphic>
                     <a:graphicData uri="http://schemas.openxmlformats.org/drawingml/2006/picture">
                       <pic:pic>
                         <pic:nvPicPr>
-                          <pic:cNvPr id="0" name="image23.png"/>
+                          <pic:cNvPr id="0" name="image10.png"/>
                           <pic:cNvPicPr preferRelativeResize="0"/>
                         </pic:nvPicPr>
                         <pic:blipFill>
@@ -19158,12 +19140,12 @@
                 <wp:inline distB="114300" distT="114300" distL="114300" distR="114300">
                   <wp:extent cx="2105025" cy="1473200"/>
                   <wp:effectExtent b="0" l="0" r="0" t="0"/>
-                  <wp:docPr id="17" name="image9.png"/>
+                  <wp:docPr id="17" name="image2.png"/>
                   <a:graphic>
                     <a:graphicData uri="http://schemas.openxmlformats.org/drawingml/2006/picture">
                       <pic:pic>
                         <pic:nvPicPr>
-                          <pic:cNvPr id="0" name="image9.png"/>
+                          <pic:cNvPr id="0" name="image2.png"/>
                           <pic:cNvPicPr preferRelativeResize="0"/>
                         </pic:nvPicPr>
                         <pic:blipFill>
@@ -19245,12 +19227,12 @@
                 <wp:inline distB="114300" distT="114300" distL="114300" distR="114300">
                   <wp:extent cx="3137643" cy="1286434"/>
                   <wp:effectExtent b="0" l="0" r="0" t="0"/>
-                  <wp:docPr id="42" name="image33.png"/>
+                  <wp:docPr id="42" name="image28.png"/>
                   <a:graphic>
                     <a:graphicData uri="http://schemas.openxmlformats.org/drawingml/2006/picture">
                       <pic:pic>
                         <pic:nvPicPr>
-                          <pic:cNvPr id="0" name="image33.png"/>
+                          <pic:cNvPr id="0" name="image28.png"/>
                           <pic:cNvPicPr preferRelativeResize="0"/>
                         </pic:nvPicPr>
                         <pic:blipFill>
@@ -19498,12 +19480,12 @@
                 <wp:inline distB="114300" distT="114300" distL="114300" distR="114300">
                   <wp:extent cx="2105025" cy="1447800"/>
                   <wp:effectExtent b="0" l="0" r="0" t="0"/>
-                  <wp:docPr id="25" name="image12.png"/>
+                  <wp:docPr id="25" name="image9.png"/>
                   <a:graphic>
                     <a:graphicData uri="http://schemas.openxmlformats.org/drawingml/2006/picture">
                       <pic:pic>
                         <pic:nvPicPr>
-                          <pic:cNvPr id="0" name="image12.png"/>
+                          <pic:cNvPr id="0" name="image9.png"/>
                           <pic:cNvPicPr preferRelativeResize="0"/>
                         </pic:nvPicPr>
                         <pic:blipFill>
@@ -19585,12 +19567,12 @@
                 <wp:inline distB="114300" distT="114300" distL="114300" distR="114300">
                   <wp:extent cx="3112880" cy="1309688"/>
                   <wp:effectExtent b="0" l="0" r="0" t="0"/>
-                  <wp:docPr id="24" name="image27.png"/>
+                  <wp:docPr id="24" name="image3.png"/>
                   <a:graphic>
                     <a:graphicData uri="http://schemas.openxmlformats.org/drawingml/2006/picture">
                       <pic:pic>
                         <pic:nvPicPr>
-                          <pic:cNvPr id="0" name="image27.png"/>
+                          <pic:cNvPr id="0" name="image3.png"/>
                           <pic:cNvPicPr preferRelativeResize="0"/>
                         </pic:nvPicPr>
                         <pic:blipFill>
@@ -19892,12 +19874,12 @@
                 <wp:inline distB="114300" distT="114300" distL="114300" distR="114300">
                   <wp:extent cx="2603224" cy="1700261"/>
                   <wp:effectExtent b="0" l="0" r="0" t="0"/>
-                  <wp:docPr id="28" name="image21.png"/>
+                  <wp:docPr id="28" name="image8.png"/>
                   <a:graphic>
                     <a:graphicData uri="http://schemas.openxmlformats.org/drawingml/2006/picture">
                       <pic:pic>
                         <pic:nvPicPr>
-                          <pic:cNvPr id="0" name="image21.png"/>
+                          <pic:cNvPr id="0" name="image8.png"/>
                           <pic:cNvPicPr preferRelativeResize="0"/>
                         </pic:nvPicPr>
                         <pic:blipFill>
@@ -19979,12 +19961,12 @@
                 <wp:inline distB="114300" distT="114300" distL="114300" distR="114300">
                   <wp:extent cx="2576513" cy="1730213"/>
                   <wp:effectExtent b="0" l="0" r="0" t="0"/>
-                  <wp:docPr id="41" name="image31.png"/>
+                  <wp:docPr id="41" name="image24.png"/>
                   <a:graphic>
                     <a:graphicData uri="http://schemas.openxmlformats.org/drawingml/2006/picture">
                       <pic:pic>
                         <pic:nvPicPr>
-                          <pic:cNvPr id="0" name="image31.png"/>
+                          <pic:cNvPr id="0" name="image24.png"/>
                           <pic:cNvPicPr preferRelativeResize="0"/>
                         </pic:nvPicPr>
                         <pic:blipFill>
@@ -20236,12 +20218,12 @@
                 <wp:inline distB="114300" distT="114300" distL="114300" distR="114300">
                   <wp:extent cx="2627222" cy="1738313"/>
                   <wp:effectExtent b="0" l="0" r="0" t="0"/>
-                  <wp:docPr id="44" name="image37.png"/>
+                  <wp:docPr id="44" name="image30.png"/>
                   <a:graphic>
                     <a:graphicData uri="http://schemas.openxmlformats.org/drawingml/2006/picture">
                       <pic:pic>
                         <pic:nvPicPr>
-                          <pic:cNvPr id="0" name="image37.png"/>
+                          <pic:cNvPr id="0" name="image30.png"/>
                           <pic:cNvPicPr preferRelativeResize="0"/>
                         </pic:nvPicPr>
                         <pic:blipFill>
@@ -20323,12 +20305,12 @@
                 <wp:inline distB="114300" distT="114300" distL="114300" distR="114300">
                   <wp:extent cx="2595563" cy="1736533"/>
                   <wp:effectExtent b="0" l="0" r="0" t="0"/>
-                  <wp:docPr id="43" name="image38.png"/>
+                  <wp:docPr id="43" name="image36.png"/>
                   <a:graphic>
                     <a:graphicData uri="http://schemas.openxmlformats.org/drawingml/2006/picture">
                       <pic:pic>
                         <pic:nvPicPr>
-                          <pic:cNvPr id="0" name="image38.png"/>
+                          <pic:cNvPr id="0" name="image36.png"/>
                           <pic:cNvPicPr preferRelativeResize="0"/>
                         </pic:nvPicPr>
                         <pic:blipFill>
@@ -22905,12 +22887,12 @@
           <wp:inline distB="114300" distT="114300" distL="114300" distR="114300">
             <wp:extent cx="5957888" cy="2837538"/>
             <wp:effectExtent b="0" l="0" r="0" t="0"/>
-            <wp:docPr id="23" name="image5.png"/>
+            <wp:docPr id="23" name="image7.png"/>
             <a:graphic>
               <a:graphicData uri="http://schemas.openxmlformats.org/drawingml/2006/picture">
                 <pic:pic>
                   <pic:nvPicPr>
-                    <pic:cNvPr id="0" name="image5.png"/>
+                    <pic:cNvPr id="0" name="image7.png"/>
                     <pic:cNvPicPr preferRelativeResize="0"/>
                   </pic:nvPicPr>
                   <pic:blipFill>
@@ -23095,12 +23077,12 @@
           <wp:inline distB="114300" distT="114300" distL="114300" distR="114300">
             <wp:extent cx="5200650" cy="5815160"/>
             <wp:effectExtent b="0" l="0" r="0" t="0"/>
-            <wp:docPr id="16" name="image10.png"/>
+            <wp:docPr id="16" name="image29.png"/>
             <a:graphic>
               <a:graphicData uri="http://schemas.openxmlformats.org/drawingml/2006/picture">
                 <pic:pic>
                   <pic:nvPicPr>
-                    <pic:cNvPr id="0" name="image10.png"/>
+                    <pic:cNvPr id="0" name="image29.png"/>
                     <pic:cNvPicPr preferRelativeResize="0"/>
                   </pic:nvPicPr>
                   <pic:blipFill>

</xml_diff>